<commit_message>
LLM benchmark results (agent lane, leak-controlled scoring), draft paper with all results
Co-Authored-By: Claude Fable 5 <noreply@anthropic.com>
Claude-Session: https://claude.ai/code/session_018XAsB6afLZTP8oRZGAaovd
</commit_message>
<xml_diff>
--- a/FoamGPT_Draft_Paper.docx
+++ b/FoamGPT_Draft_Paper.docx
@@ -51,7 +51,7 @@
         <w:rPr>
           <w:i w:val="0"/>
         </w:rPr>
-        <w:t>Syntactic foams — hollow-particle-filled composites — have a three-decade experimental literature whose quantitative results remain locked in PDF tables and figures. We present FoamGPT, an open pipeline and dataset that converts that literature into a machine-readable process–structure–property (PSP) table with per-value provenance. From 1,329 relevant papers identified in OpenAlex (1990–2026) we processed the 93 open-access papers, of which 80 were confirmed on-topic, and extracted 951 records (738 primary measurements, 152 literature-quoted values, 61 model results) using a large language model constrained by a 40-field schema, a no-guessing rule, and mandatory verbatim evidence quotes. Automated physical-range checks flag 51 records for expert review. The extracted data reproduce known structure–property trends without post-processing. Using paper-level cross-validation, a random forest predicts foam density from processing descriptors alone (R² = 0.80) but cannot yet predict modulus or strength across laboratories (R² &lt; 0), quantifying how far recipe-level features are from transferable mechanical prediction at this data scale. We release the dataset, extraction prompts, and benchmark code, and describe a validation protocol and the remaining barriers — figure-only reporting, paywalled corpora, and unit/definition heterogeneity — to a complete literature-scale dataset.</w:t>
+        <w:t>Syntactic foams — hollow-particle-filled composites — have a three-decade experimental literature whose quantitative results remain locked in PDF tables and figures. We present FoamGPT, an open pipeline and dataset that converts that literature into a machine-readable process–structure–property (PSP) table with per-value provenance. From 1,329 relevant papers identified in OpenAlex (1990–2026) we processed the 93 open-access papers, of which 80 were confirmed on-topic, and extracted 951 records (738 primary measurements, 152 literature-quoted values, 61 model results) using a large language model constrained by a 40-field schema, a no-guessing rule, and mandatory verbatim evidence quotes. Automated physical-range checks flag 51 records for expert review. The extracted data reproduce known structure–property trends without post-processing. Using paper-level cross-validation, a random forest predicts foam density from processing descriptors alone (R² = 0.80) but cannot yet predict modulus or strength across laboratories (R² &lt; 0), quantifying how far recipe-level features are from transferable mechanical prediction at this data scale. A frontier LLM asked to predict compressive strength from the recipe alone achieves a median absolute percentage error of 43% with 63% empirical coverage of its stated 90% intervals; supplying five retrieved records from other papers changes these to 37% and 82%. We release the dataset, extraction prompts, and benchmark code, and describe a validation protocol and the remaining barriers — figure-only reporting, paywalled corpora, and unit/definition heterogeneity — to a complete literature-scale dataset.</w:t>
       </w:r>
     </w:p>
     <w:p>
@@ -1270,9 +1270,617 @@
     <w:p>
       <w:r>
         <w:rPr>
+          <w:i/>
+        </w:rPr>
+        <w:t>Table 3. LLM (Claude Opus 5) prediction on held-out records, zero-shot and with five retrieved records from other papers.</w:t>
+      </w:r>
+    </w:p>
+    <w:tbl>
+      <w:tblPr>
+        <w:tblStyle w:val="LightGrid-Accent1"/>
+        <w:tblW w:type="auto" w:w="0"/>
+        <w:jc w:val="center"/>
+        <w:tblLook w:firstColumn="1" w:firstRow="1" w:lastColumn="0" w:lastRow="0" w:noHBand="0" w:noVBand="1" w:val="04A0"/>
+      </w:tblPr>
+      <w:tblGrid>
+        <w:gridCol w:w="1337"/>
+        <w:gridCol w:w="1337"/>
+        <w:gridCol w:w="1337"/>
+        <w:gridCol w:w="1337"/>
+        <w:gridCol w:w="1337"/>
+        <w:gridCol w:w="1337"/>
+        <w:gridCol w:w="1337"/>
+      </w:tblGrid>
+      <w:tr>
+        <w:tc>
+          <w:tcPr>
+            <w:tcW w:type="dxa" w:w="2160"/>
+          </w:tcPr>
+          <w:p>
+            <w:r/>
+            <w:r>
+              <w:rPr>
+                <w:b/>
+              </w:rPr>
+              <w:t>Target</w:t>
+            </w:r>
+          </w:p>
+        </w:tc>
+        <w:tc>
+          <w:tcPr>
+            <w:tcW w:type="dxa" w:w="1296"/>
+          </w:tcPr>
+          <w:p>
+            <w:r/>
+            <w:r>
+              <w:rPr>
+                <w:b/>
+              </w:rPr>
+              <w:t>Condition</w:t>
+            </w:r>
+          </w:p>
+        </w:tc>
+        <w:tc>
+          <w:tcPr>
+            <w:tcW w:type="dxa" w:w="720"/>
+          </w:tcPr>
+          <w:p>
+            <w:r/>
+            <w:r>
+              <w:rPr>
+                <w:b/>
+              </w:rPr>
+              <w:t>n</w:t>
+            </w:r>
+          </w:p>
+        </w:tc>
+        <w:tc>
+          <w:tcPr>
+            <w:tcW w:type="dxa" w:w="1440"/>
+          </w:tcPr>
+          <w:p>
+            <w:r/>
+            <w:r>
+              <w:rPr>
+                <w:b/>
+              </w:rPr>
+              <w:t>median APE %</w:t>
+            </w:r>
+          </w:p>
+        </w:tc>
+        <w:tc>
+          <w:tcPr>
+            <w:tcW w:type="dxa" w:w="1440"/>
+          </w:tcPr>
+          <w:p>
+            <w:r/>
+            <w:r>
+              <w:rPr>
+                <w:b/>
+              </w:rPr>
+              <w:t>mean APE %</w:t>
+            </w:r>
+          </w:p>
+        </w:tc>
+        <w:tc>
+          <w:tcPr>
+            <w:tcW w:type="dxa" w:w="1152"/>
+          </w:tcPr>
+          <w:p>
+            <w:r/>
+            <w:r>
+              <w:rPr>
+                <w:b/>
+              </w:rPr>
+              <w:t>log-R²</w:t>
+            </w:r>
+          </w:p>
+        </w:tc>
+        <w:tc>
+          <w:tcPr>
+            <w:tcW w:type="dxa" w:w="1440"/>
+          </w:tcPr>
+          <w:p>
+            <w:r/>
+            <w:r>
+              <w:rPr>
+                <w:b/>
+              </w:rPr>
+              <w:t>90% coverage</w:t>
+            </w:r>
+          </w:p>
+        </w:tc>
+      </w:tr>
+      <w:tr>
+        <w:tc>
+          <w:tcPr>
+            <w:tcW w:type="dxa" w:w="2160"/>
+          </w:tcPr>
+          <w:p>
+            <w:r>
+              <w:t>measured_density_g_cc</w:t>
+            </w:r>
+          </w:p>
+        </w:tc>
+        <w:tc>
+          <w:tcPr>
+            <w:tcW w:type="dxa" w:w="1296"/>
+          </w:tcPr>
+          <w:p>
+            <w:r>
+              <w:t>rag_5</w:t>
+            </w:r>
+          </w:p>
+        </w:tc>
+        <w:tc>
+          <w:tcPr>
+            <w:tcW w:type="dxa" w:w="720"/>
+          </w:tcPr>
+          <w:p>
+            <w:r>
+              <w:t>32</w:t>
+            </w:r>
+          </w:p>
+        </w:tc>
+        <w:tc>
+          <w:tcPr>
+            <w:tcW w:type="dxa" w:w="1440"/>
+          </w:tcPr>
+          <w:p>
+            <w:r>
+              <w:t>1</w:t>
+            </w:r>
+          </w:p>
+        </w:tc>
+        <w:tc>
+          <w:tcPr>
+            <w:tcW w:type="dxa" w:w="1440"/>
+          </w:tcPr>
+          <w:p>
+            <w:r>
+              <w:t>7</w:t>
+            </w:r>
+          </w:p>
+        </w:tc>
+        <w:tc>
+          <w:tcPr>
+            <w:tcW w:type="dxa" w:w="1152"/>
+          </w:tcPr>
+          <w:p>
+            <w:r>
+              <w:t>0.89</w:t>
+            </w:r>
+          </w:p>
+        </w:tc>
+        <w:tc>
+          <w:tcPr>
+            <w:tcW w:type="dxa" w:w="1440"/>
+          </w:tcPr>
+          <w:p>
+            <w:r>
+              <w:t>84%</w:t>
+            </w:r>
+          </w:p>
+        </w:tc>
+      </w:tr>
+      <w:tr>
+        <w:tc>
+          <w:tcPr>
+            <w:tcW w:type="dxa" w:w="2160"/>
+          </w:tcPr>
+          <w:p>
+            <w:r>
+              <w:t>measured_density_g_cc</w:t>
+            </w:r>
+          </w:p>
+        </w:tc>
+        <w:tc>
+          <w:tcPr>
+            <w:tcW w:type="dxa" w:w="1296"/>
+          </w:tcPr>
+          <w:p>
+            <w:r>
+              <w:t>zero_shot</w:t>
+            </w:r>
+          </w:p>
+        </w:tc>
+        <w:tc>
+          <w:tcPr>
+            <w:tcW w:type="dxa" w:w="720"/>
+          </w:tcPr>
+          <w:p>
+            <w:r>
+              <w:t>32</w:t>
+            </w:r>
+          </w:p>
+        </w:tc>
+        <w:tc>
+          <w:tcPr>
+            <w:tcW w:type="dxa" w:w="1440"/>
+          </w:tcPr>
+          <w:p>
+            <w:r>
+              <w:t>7</w:t>
+            </w:r>
+          </w:p>
+        </w:tc>
+        <w:tc>
+          <w:tcPr>
+            <w:tcW w:type="dxa" w:w="1440"/>
+          </w:tcPr>
+          <w:p>
+            <w:r>
+              <w:t>11</w:t>
+            </w:r>
+          </w:p>
+        </w:tc>
+        <w:tc>
+          <w:tcPr>
+            <w:tcW w:type="dxa" w:w="1152"/>
+          </w:tcPr>
+          <w:p>
+            <w:r>
+              <w:t>0.87</w:t>
+            </w:r>
+          </w:p>
+        </w:tc>
+        <w:tc>
+          <w:tcPr>
+            <w:tcW w:type="dxa" w:w="1440"/>
+          </w:tcPr>
+          <w:p>
+            <w:r>
+              <w:t>84%</w:t>
+            </w:r>
+          </w:p>
+        </w:tc>
+      </w:tr>
+      <w:tr>
+        <w:tc>
+          <w:tcPr>
+            <w:tcW w:type="dxa" w:w="2160"/>
+          </w:tcPr>
+          <w:p>
+            <w:r>
+              <w:t>modulus_mpa</w:t>
+            </w:r>
+          </w:p>
+        </w:tc>
+        <w:tc>
+          <w:tcPr>
+            <w:tcW w:type="dxa" w:w="1296"/>
+          </w:tcPr>
+          <w:p>
+            <w:r>
+              <w:t>rag_5</w:t>
+            </w:r>
+          </w:p>
+        </w:tc>
+        <w:tc>
+          <w:tcPr>
+            <w:tcW w:type="dxa" w:w="720"/>
+          </w:tcPr>
+          <w:p>
+            <w:r>
+              <w:t>29</w:t>
+            </w:r>
+          </w:p>
+        </w:tc>
+        <w:tc>
+          <w:tcPr>
+            <w:tcW w:type="dxa" w:w="1440"/>
+          </w:tcPr>
+          <w:p>
+            <w:r>
+              <w:t>30</w:t>
+            </w:r>
+          </w:p>
+        </w:tc>
+        <w:tc>
+          <w:tcPr>
+            <w:tcW w:type="dxa" w:w="1440"/>
+          </w:tcPr>
+          <w:p>
+            <w:r>
+              <w:t>77</w:t>
+            </w:r>
+          </w:p>
+        </w:tc>
+        <w:tc>
+          <w:tcPr>
+            <w:tcW w:type="dxa" w:w="1152"/>
+          </w:tcPr>
+          <w:p>
+            <w:r>
+              <w:t>0.61</w:t>
+            </w:r>
+          </w:p>
+        </w:tc>
+        <w:tc>
+          <w:tcPr>
+            <w:tcW w:type="dxa" w:w="1440"/>
+          </w:tcPr>
+          <w:p>
+            <w:r>
+              <w:t>86%</w:t>
+            </w:r>
+          </w:p>
+        </w:tc>
+      </w:tr>
+      <w:tr>
+        <w:tc>
+          <w:tcPr>
+            <w:tcW w:type="dxa" w:w="2160"/>
+          </w:tcPr>
+          <w:p>
+            <w:r>
+              <w:t>modulus_mpa</w:t>
+            </w:r>
+          </w:p>
+        </w:tc>
+        <w:tc>
+          <w:tcPr>
+            <w:tcW w:type="dxa" w:w="1296"/>
+          </w:tcPr>
+          <w:p>
+            <w:r>
+              <w:t>zero_shot</w:t>
+            </w:r>
+          </w:p>
+        </w:tc>
+        <w:tc>
+          <w:tcPr>
+            <w:tcW w:type="dxa" w:w="720"/>
+          </w:tcPr>
+          <w:p>
+            <w:r>
+              <w:t>29</w:t>
+            </w:r>
+          </w:p>
+        </w:tc>
+        <w:tc>
+          <w:tcPr>
+            <w:tcW w:type="dxa" w:w="1440"/>
+          </w:tcPr>
+          <w:p>
+            <w:r>
+              <w:t>39</w:t>
+            </w:r>
+          </w:p>
+        </w:tc>
+        <w:tc>
+          <w:tcPr>
+            <w:tcW w:type="dxa" w:w="1440"/>
+          </w:tcPr>
+          <w:p>
+            <w:r>
+              <w:t>139</w:t>
+            </w:r>
+          </w:p>
+        </w:tc>
+        <w:tc>
+          <w:tcPr>
+            <w:tcW w:type="dxa" w:w="1152"/>
+          </w:tcPr>
+          <w:p>
+            <w:r>
+              <w:t>0.41</w:t>
+            </w:r>
+          </w:p>
+        </w:tc>
+        <w:tc>
+          <w:tcPr>
+            <w:tcW w:type="dxa" w:w="1440"/>
+          </w:tcPr>
+          <w:p>
+            <w:r>
+              <w:t>76%</w:t>
+            </w:r>
+          </w:p>
+        </w:tc>
+      </w:tr>
+      <w:tr>
+        <w:tc>
+          <w:tcPr>
+            <w:tcW w:type="dxa" w:w="2160"/>
+          </w:tcPr>
+          <w:p>
+            <w:r>
+              <w:t>strength_mpa</w:t>
+            </w:r>
+          </w:p>
+        </w:tc>
+        <w:tc>
+          <w:tcPr>
+            <w:tcW w:type="dxa" w:w="1296"/>
+          </w:tcPr>
+          <w:p>
+            <w:r>
+              <w:t>rag_5</w:t>
+            </w:r>
+          </w:p>
+        </w:tc>
+        <w:tc>
+          <w:tcPr>
+            <w:tcW w:type="dxa" w:w="720"/>
+          </w:tcPr>
+          <w:p>
+            <w:r>
+              <w:t>38</w:t>
+            </w:r>
+          </w:p>
+        </w:tc>
+        <w:tc>
+          <w:tcPr>
+            <w:tcW w:type="dxa" w:w="1440"/>
+          </w:tcPr>
+          <w:p>
+            <w:r>
+              <w:t>37</w:t>
+            </w:r>
+          </w:p>
+        </w:tc>
+        <w:tc>
+          <w:tcPr>
+            <w:tcW w:type="dxa" w:w="1440"/>
+          </w:tcPr>
+          <w:p>
+            <w:r>
+              <w:t>77</w:t>
+            </w:r>
+          </w:p>
+        </w:tc>
+        <w:tc>
+          <w:tcPr>
+            <w:tcW w:type="dxa" w:w="1152"/>
+          </w:tcPr>
+          <w:p>
+            <w:r>
+              <w:t>0.62</w:t>
+            </w:r>
+          </w:p>
+        </w:tc>
+        <w:tc>
+          <w:tcPr>
+            <w:tcW w:type="dxa" w:w="1440"/>
+          </w:tcPr>
+          <w:p>
+            <w:r>
+              <w:t>82%</w:t>
+            </w:r>
+          </w:p>
+        </w:tc>
+      </w:tr>
+      <w:tr>
+        <w:tc>
+          <w:tcPr>
+            <w:tcW w:type="dxa" w:w="2160"/>
+          </w:tcPr>
+          <w:p>
+            <w:r>
+              <w:t>strength_mpa</w:t>
+            </w:r>
+          </w:p>
+        </w:tc>
+        <w:tc>
+          <w:tcPr>
+            <w:tcW w:type="dxa" w:w="1296"/>
+          </w:tcPr>
+          <w:p>
+            <w:r>
+              <w:t>zero_shot</w:t>
+            </w:r>
+          </w:p>
+        </w:tc>
+        <w:tc>
+          <w:tcPr>
+            <w:tcW w:type="dxa" w:w="720"/>
+          </w:tcPr>
+          <w:p>
+            <w:r>
+              <w:t>38</w:t>
+            </w:r>
+          </w:p>
+        </w:tc>
+        <w:tc>
+          <w:tcPr>
+            <w:tcW w:type="dxa" w:w="1440"/>
+          </w:tcPr>
+          <w:p>
+            <w:r>
+              <w:t>43</w:t>
+            </w:r>
+          </w:p>
+        </w:tc>
+        <w:tc>
+          <w:tcPr>
+            <w:tcW w:type="dxa" w:w="1440"/>
+          </w:tcPr>
+          <w:p>
+            <w:r>
+              <w:t>97</w:t>
+            </w:r>
+          </w:p>
+        </w:tc>
+        <w:tc>
+          <w:tcPr>
+            <w:tcW w:type="dxa" w:w="1152"/>
+          </w:tcPr>
+          <w:p>
+            <w:r>
+              <w:t>0.48</w:t>
+            </w:r>
+          </w:p>
+        </w:tc>
+        <w:tc>
+          <w:tcPr>
+            <w:tcW w:type="dxa" w:w="1440"/>
+          </w:tcPr>
+          <w:p>
+            <w:r>
+              <w:t>63%</w:t>
+            </w:r>
+          </w:p>
+        </w:tc>
+      </w:tr>
+    </w:tbl>
+    <w:p/>
+    <w:p>
+      <w:pPr>
+        <w:jc w:val="center"/>
+      </w:pPr>
+      <w:r>
+        <w:drawing>
+          <wp:inline xmlns:a="http://schemas.openxmlformats.org/drawingml/2006/main" xmlns:pic="http://schemas.openxmlformats.org/drawingml/2006/picture">
+            <wp:extent cx="5486400" cy="1741714"/>
+            <wp:docPr id="4" name="Picture 4"/>
+            <wp:cNvGraphicFramePr>
+              <a:graphicFrameLocks noChangeAspect="1"/>
+            </wp:cNvGraphicFramePr>
+            <a:graphic>
+              <a:graphicData uri="http://schemas.openxmlformats.org/drawingml/2006/picture">
+                <pic:pic>
+                  <pic:nvPicPr>
+                    <pic:cNvPr id="0" name="llm_vs_ml.png"/>
+                    <pic:cNvPicPr/>
+                  </pic:nvPicPr>
+                  <pic:blipFill>
+                    <a:blip r:embed="rId12"/>
+                    <a:stretch>
+                      <a:fillRect/>
+                    </a:stretch>
+                  </pic:blipFill>
+                  <pic:spPr>
+                    <a:xfrm>
+                      <a:off x="0" y="0"/>
+                      <a:ext cx="5486400" cy="1741714"/>
+                    </a:xfrm>
+                    <a:prstGeom prst="rect"/>
+                  </pic:spPr>
+                </pic:pic>
+              </a:graphicData>
+            </a:graphic>
+          </wp:inline>
+        </w:drawing>
+      </w:r>
+    </w:p>
+    <w:p>
+      <w:pPr>
+        <w:jc w:val="center"/>
+      </w:pPr>
+      <w:r>
+        <w:rPr>
+          <w:i/>
+        </w:rPr>
+        <w:t>Figure 4. LLM predictions versus measured values (log axes), zero-shot and retrieval-augmented; dashed line is identity.</w:t>
+      </w:r>
+    </w:p>
+    <w:p>
+      <w:r>
+        <w:rPr>
           <w:i w:val="0"/>
         </w:rPr>
-        <w:t>[LLM benchmark running — table and figure inserted automatically when data/benchmarks/llm_agent_summary.csv exists.]</w:t>
+        <w:t>[Interpretation to be written once numbers are final: compare LLM zero-shot MAPE with the ML baselines in Table 2 on the same targets; report whether the 90% intervals are over- or under-confident; note where retrieval helps most (matrix classes with dense literature) and where it fails.]</w:t>
       </w:r>
     </w:p>
     <w:p>

</xml_diff>

<commit_message>
Draft paper: LLM benchmark interpretation and caveats
Co-Authored-By: Claude Fable 5 <noreply@anthropic.com>
Claude-Session: https://claude.ai/code/session_018XAsB6afLZTP8oRZGAaovd
</commit_message>
<xml_diff>
--- a/FoamGPT_Draft_Paper.docx
+++ b/FoamGPT_Draft_Paper.docx
@@ -1880,7 +1880,15 @@
         <w:rPr>
           <w:i w:val="0"/>
         </w:rPr>
-        <w:t>[Interpretation to be written once numbers are final: compare LLM zero-shot MAPE with the ML baselines in Table 2 on the same targets; report whether the 90% intervals are over- or under-confident; note where retrieval helps most (matrix classes with dense literature) and where it fails.]</w:t>
+        <w:t>Scoring excluded 10 unfilled-matrix control rows and 12 density tasks whose record also appeared as a strength/modulus task in the same batch (its density was visible as an input there). Three observations follow. First, zero-shot, the LLM is a far better predictor of mechanical properties than the cross-laboratory ML baselines: median absolute percentage error is 43% for strength and 39% for modulus (log-R² 0.48 and 0.41), against tree-ensemble MAPE above 85% and log-R² ≤ 0.18. The LLM brings prior knowledge of matrix classes, microballoon grades and typical property ranges that 140 training rows cannot supply; for density its zero-shot error (7% median) is comparable to the random forest, because both are essentially applying the rule of mixtures. Second, retrieval helps: five records from other papers reduce median error to 37% (strength), 30% (modulus) and 1.5% (density), and raise log-R² to 0.62 / 0.61 / 0.89. Third, calibration is imperfect but not wildly so: empirical coverage of the stated 90% intervals is 63% (strength) and 76% (modulus) zero-shot — over-confident — and improves to 82% and 86% with retrieval. Mean errors remain large (97% zero-shot strength) because of a heavy tail: under-specified records (no volume fraction or density), split-Hopkinson-bar moduli, and metal-matrix rows where 'strength' may denote yield, peak or plateau stress.</w:t>
+      </w:r>
+    </w:p>
+    <w:p>
+      <w:r>
+        <w:rPr>
+          <w:i w:val="0"/>
+        </w:rPr>
+        <w:t>Caveats specific to this benchmark: (i) the retrieval pool falls back to the nearest volume fraction regardless of matrix when a matrix/particle class is sparse, so several aluminium targets received polymer-foam references — retrieval was therefore a distractor for some tasks and the RAG gain is a lower bound for a class-aware retriever; (ii) 'other papers' can be other theses from the same research group with identical materials, a same-laboratory channel that paper-level splitting does not close; (iii) a few task pairs share byte-identical descriptors with different measured values, bounding achievable error; (iv) the model was prompted through Claude Code with file access restricted to the task text, but it is the same model family that performed extraction.</w:t>
       </w:r>
     </w:p>
     <w:p>

</xml_diff>

<commit_message>
Paper: benchmark-integrity subsection and appendix of records flagged for validation
Co-Authored-By: Claude Fable 5 <noreply@anthropic.com>
Claude-Session: https://claude.ai/code/session_018XAsB6afLZTP8oRZGAaovd
</commit_message>
<xml_diff>
--- a/FoamGPT_Draft_Paper.docx
+++ b/FoamGPT_Draft_Paper.docx
@@ -1893,6 +1893,30 @@
     </w:p>
     <w:p>
       <w:pPr>
+        <w:pStyle w:val="Heading2"/>
+      </w:pPr>
+      <w:r>
+        <w:t>4.5 Benchmark integrity: the model under test found the leaks</w:t>
+      </w:r>
+    </w:p>
+    <w:p>
+      <w:r>
+        <w:rPr>
+          <w:i w:val="0"/>
+        </w:rPr>
+        <w:t>The first benchmark run was invalidated by the agents answering it. Independently, several reported that (i) density tasks listed the measured density among the input descriptors, (ii) retrieved 'reference' rows were sometimes other benchmark targets, and (iii) two targets from one record shared a batch so that one prompt disclosed the other's answer. The harness was rebuilt — target masked from descriptors, all benchmark rows removed from the retrieval pool, zero-shot and retrieval tasks separated into disjoint batches, task identifiers made target-specific — and every answer was discarded and regenerated. Residual sibling exposure of density values was handled by exclusion at scoring (Table 3 counts). We report this because it is a general hazard for LLM benchmarks built from tabular datasets: a capable model will read the whole batch it is given, and any co-derived field is a leak.</w:t>
+      </w:r>
+    </w:p>
+    <w:p>
+      <w:r>
+        <w:rPr>
+          <w:i w:val="0"/>
+        </w:rPr>
+        <w:t>The same agents also flagged records whose values are physically implausible or internally inconsistent; these are listed in Appendix A and form the first targets of the expert validation pass.</w:t>
+      </w:r>
+    </w:p>
+    <w:p>
+      <w:pPr>
         <w:pStyle w:val="Heading1"/>
       </w:pPr>
       <w:r>
@@ -2003,6 +2027,400 @@
         <w:t>Dataset (CSV/Parquet), per-paper extractions with evidence (JSONL), prompts, schema, curation and benchmark code: https://github.com/Harshelite2503/foamgpt (MIT). A Zenodo DOI will accompany the validated release.</w:t>
       </w:r>
     </w:p>
+    <w:p>
+      <w:pPr>
+        <w:pStyle w:val="Heading1"/>
+      </w:pPr>
+      <w:r>
+        <w:t>Appendix A. Records flagged for expert validation</w:t>
+      </w:r>
+    </w:p>
+    <w:p>
+      <w:r>
+        <w:rPr>
+          <w:i w:val="0"/>
+        </w:rPr>
+        <w:t>Flags raised by the benchmark agents and by automated range checks; each should be resolved against the source PDF before the validated release.</w:t>
+      </w:r>
+    </w:p>
+    <w:tbl>
+      <w:tblPr>
+        <w:tblStyle w:val="LightGrid-Accent1"/>
+        <w:tblW w:type="auto" w:w="0"/>
+        <w:jc w:val="center"/>
+        <w:tblLook w:firstColumn="1" w:firstRow="1" w:lastColumn="0" w:lastRow="0" w:noHBand="0" w:noVBand="1" w:val="04A0"/>
+      </w:tblPr>
+      <w:tblGrid>
+        <w:gridCol w:w="3120"/>
+        <w:gridCol w:w="3120"/>
+        <w:gridCol w:w="3120"/>
+      </w:tblGrid>
+      <w:tr>
+        <w:tc>
+          <w:tcPr>
+            <w:tcW w:type="dxa" w:w="2736"/>
+          </w:tcPr>
+          <w:p>
+            <w:r/>
+            <w:r>
+              <w:rPr>
+                <w:b/>
+              </w:rPr>
+              <w:t>Paper</w:t>
+            </w:r>
+          </w:p>
+        </w:tc>
+        <w:tc>
+          <w:tcPr>
+            <w:tcW w:type="dxa" w:w="5184"/>
+          </w:tcPr>
+          <w:p>
+            <w:r/>
+            <w:r>
+              <w:rPr>
+                <w:b/>
+              </w:rPr>
+              <w:t>Issue</w:t>
+            </w:r>
+          </w:p>
+        </w:tc>
+        <w:tc>
+          <w:tcPr>
+            <w:tcW w:type="dxa" w:w="1440"/>
+          </w:tcPr>
+          <w:p>
+            <w:r/>
+            <w:r>
+              <w:rPr>
+                <w:b/>
+              </w:rPr>
+              <w:t>Records</w:t>
+            </w:r>
+          </w:p>
+        </w:tc>
+      </w:tr>
+      <w:tr>
+        <w:tc>
+          <w:tcPr>
+            <w:tcW w:type="dxa" w:w="2736"/>
+          </w:tcPr>
+          <w:p>
+            <w:r>
+              <w:t>W4302024750 (Al7075 + ceramic microspheres, SHPB)</w:t>
+            </w:r>
+          </w:p>
+        </w:tc>
+        <w:tc>
+          <w:tcPr>
+            <w:tcW w:type="dxa" w:w="5184"/>
+          </w:tcPr>
+          <w:p>
+            <w:r>
+              <w:t>Foam densities 2.25–2.39 g/cm³ at 66 vol% hollow spheres are close to bulk-alloy density; rule of mixtures implies ~1.6 g/cm³. Check whether Table 3 lists relative density or the particles are thick-walled.</w:t>
+            </w:r>
+          </w:p>
+        </w:tc>
+        <w:tc>
+          <w:tcPr>
+            <w:tcW w:type="dxa" w:w="1440"/>
+          </w:tcPr>
+          <w:p>
+            <w:r>
+              <w:t>000–005</w:t>
+            </w:r>
+          </w:p>
+        </w:tc>
+      </w:tr>
+      <w:tr>
+        <w:tc>
+          <w:tcPr>
+            <w:tcW w:type="dxa" w:w="2736"/>
+          </w:tcPr>
+          <w:p>
+            <w:r>
+              <w:t>W2290445848 (Ifremer thesis, GSPU/GSEP)</w:t>
+            </w:r>
+          </w:p>
+        </w:tc>
+        <w:tc>
+          <w:tcPr>
+            <w:tcW w:type="dxa" w:w="5184"/>
+          </w:tcPr>
+          <w:p>
+            <w:r>
+              <w:t>particle_true_density_g_cc varies per row (0.42–0.99) for 3M S38 (0.38 g/cm³): the extractor stored recovered-filler specific gravity after hydrostatic loading in this field. Move to notes.</w:t>
+            </w:r>
+          </w:p>
+        </w:tc>
+        <w:tc>
+          <w:tcPr>
+            <w:tcW w:type="dxa" w:w="1440"/>
+          </w:tcPr>
+          <w:p>
+            <w:r>
+              <w:t>026–044</w:t>
+            </w:r>
+          </w:p>
+        </w:tc>
+      </w:tr>
+      <w:tr>
+        <w:tc>
+          <w:tcPr>
+            <w:tcW w:type="dxa" w:w="2736"/>
+          </w:tcPr>
+          <w:p>
+            <w:r>
+              <w:t>W2900342134 (layered IFGSF thesis)</w:t>
+            </w:r>
+          </w:p>
+        </w:tc>
+        <w:tc>
+          <w:tcPr>
+            <w:tcW w:type="dxa" w:w="5184"/>
+          </w:tcPr>
+          <w:p>
+            <w:r>
+              <w:t>Moduli bimodal (720–790 vs 1920–1930 MPa) for nominally similar foams; likely flat-wise vs edge-wise or two quantities collapsed. Two layups share density 0.6386 (row alignment?).</w:t>
+            </w:r>
+          </w:p>
+        </w:tc>
+        <w:tc>
+          <w:tcPr>
+            <w:tcW w:type="dxa" w:w="1440"/>
+          </w:tcPr>
+          <w:p>
+            <w:r>
+              <w:t>000–011</w:t>
+            </w:r>
+          </w:p>
+        </w:tc>
+      </w:tr>
+      <w:tr>
+        <w:tc>
+          <w:tcPr>
+            <w:tcW w:type="dxa" w:w="2736"/>
+          </w:tcPr>
+          <w:p>
+            <w:r>
+              <w:t>W2396011947 (PU + A20/1000 balloons)</w:t>
+            </w:r>
+          </w:p>
+        </w:tc>
+        <w:tc>
+          <w:tcPr>
+            <w:tcW w:type="dxa" w:w="5184"/>
+          </w:tcPr>
+          <w:p>
+            <w:r>
+              <w:t>Density rises with balloon weight fraction (0.25 → 0.38 g/cm³) although balloons are lighter than matrix; weight fraction may be resin fraction.</w:t>
+            </w:r>
+          </w:p>
+        </w:tc>
+        <w:tc>
+          <w:tcPr>
+            <w:tcW w:type="dxa" w:w="1440"/>
+          </w:tcPr>
+          <w:p>
+            <w:r>
+              <w:t>000–003</w:t>
+            </w:r>
+          </w:p>
+        </w:tc>
+      </w:tr>
+      <w:tr>
+        <w:tc>
+          <w:tcPr>
+            <w:tcW w:type="dxa" w:w="2736"/>
+          </w:tcPr>
+          <w:p>
+            <w:r>
+              <w:t>W4382982980 (HGM/epoxy sandwich thesis)</w:t>
+            </w:r>
+          </w:p>
+        </w:tc>
+        <w:tc>
+          <w:tcPr>
+            <w:tcW w:type="dxa" w:w="5184"/>
+          </w:tcPr>
+          <w:p>
+            <w:r>
+              <w:t>Near-identical densities (0.865 vs 0.872) with flexural strengths 41 vs 133 MPa; shear strength 2.7 MPa an order of magnitude low; particle_true_density 0.55–0.75 for T60 (0.6).</w:t>
+            </w:r>
+          </w:p>
+        </w:tc>
+        <w:tc>
+          <w:tcPr>
+            <w:tcW w:type="dxa" w:w="1440"/>
+          </w:tcPr>
+          <w:p>
+            <w:r>
+              <w:t>138–153</w:t>
+            </w:r>
+          </w:p>
+        </w:tc>
+      </w:tr>
+      <w:tr>
+        <w:tc>
+          <w:tcPr>
+            <w:tcW w:type="dxa" w:w="2736"/>
+          </w:tcPr>
+          <w:p>
+            <w:r>
+              <w:t>W2229720391 (AlSi12 hybrid spheres)</w:t>
+            </w:r>
+          </w:p>
+        </w:tc>
+        <w:tc>
+          <w:tcPr>
+            <w:tcW w:type="dxa" w:w="5184"/>
+          </w:tcPr>
+          <w:p>
+            <w:r>
+              <w:t>Stated Globomet density 0.4 g/cm³ and Vf 0.64 cannot reproduce hybrid densities 1.69/1.74; effective Vf ≈ 0.5.</w:t>
+            </w:r>
+          </w:p>
+        </w:tc>
+        <w:tc>
+          <w:tcPr>
+            <w:tcW w:type="dxa" w:w="1440"/>
+          </w:tcPr>
+          <w:p>
+            <w:r>
+              <w:t>000–009</w:t>
+            </w:r>
+          </w:p>
+        </w:tc>
+      </w:tr>
+      <w:tr>
+        <w:tc>
+          <w:tcPr>
+            <w:tcW w:type="dxa" w:w="2736"/>
+          </w:tcPr>
+          <w:p>
+            <w:r>
+              <w:t>W2766120207 (vinyl-ester foam)</w:t>
+            </w:r>
+          </w:p>
+        </w:tc>
+        <w:tc>
+          <w:tcPr>
+            <w:tcW w:type="dxa" w:w="5184"/>
+          </w:tcPr>
+          <w:p>
+            <w:r>
+              <w:t>Tensile modulus 9.92 GPa implausible for the material; recorded with confidence 0.35.</w:t>
+            </w:r>
+          </w:p>
+        </w:tc>
+        <w:tc>
+          <w:tcPr>
+            <w:tcW w:type="dxa" w:w="1440"/>
+          </w:tcPr>
+          <w:p>
+            <w:r>
+              <w:t>003</w:t>
+            </w:r>
+          </w:p>
+        </w:tc>
+      </w:tr>
+      <w:tr>
+        <w:tc>
+          <w:tcPr>
+            <w:tcW w:type="dxa" w:w="2736"/>
+          </w:tcPr>
+          <w:p>
+            <w:r>
+              <w:t>W2420155152, W4416695887, W2229720391</w:t>
+            </w:r>
+          </w:p>
+        </w:tc>
+        <w:tc>
+          <w:tcPr>
+            <w:tcW w:type="dxa" w:w="5184"/>
+          </w:tcPr>
+          <w:p>
+            <w:r>
+              <w:t>Metal-matrix 'moduli' of 14–29 MPa are ISO 13314 structural stiffness in GPa or machine compliance; now flagged modulus_maybe_gpa and excluded from benchmarks.</w:t>
+            </w:r>
+          </w:p>
+        </w:tc>
+        <w:tc>
+          <w:tcPr>
+            <w:tcW w:type="dxa" w:w="1440"/>
+          </w:tcPr>
+          <w:p>
+            <w:r>
+              <w:t>flagged rows</w:t>
+            </w:r>
+          </w:p>
+        </w:tc>
+      </w:tr>
+      <w:tr>
+        <w:tc>
+          <w:tcPr>
+            <w:tcW w:type="dxa" w:w="2736"/>
+          </w:tcPr>
+          <w:p>
+            <w:r>
+              <w:t>W4394017182, W2728148627</w:t>
+            </w:r>
+          </w:p>
+        </w:tc>
+        <w:tc>
+          <w:tcPr>
+            <w:tcW w:type="dxa" w:w="5184"/>
+          </w:tcPr>
+          <w:p>
+            <w:r>
+              <w:t>Byte-identical descriptors with different measured values (duplicate rows or missing distinguishing condition).</w:t>
+            </w:r>
+          </w:p>
+        </w:tc>
+        <w:tc>
+          <w:tcPr>
+            <w:tcW w:type="dxa" w:w="1440"/>
+          </w:tcPr>
+          <w:p>
+            <w:r>
+              <w:t>012/018/014/019; 005/020/014/016</w:t>
+            </w:r>
+          </w:p>
+        </w:tc>
+      </w:tr>
+      <w:tr>
+        <w:tc>
+          <w:tcPr>
+            <w:tcW w:type="dxa" w:w="2736"/>
+          </w:tcPr>
+          <w:p>
+            <w:r>
+              <w:t>Automated range flags</w:t>
+            </w:r>
+          </w:p>
+        </w:tc>
+        <w:tc>
+          <w:tcPr>
+            <w:tcW w:type="dxa" w:w="5184"/>
+          </w:tcPr>
+          <w:p>
+            <w:r>
+              <w:t>matrix_porosity_fraction out of range (13), particle_weight_fraction (9), particle_mean_diameter_um (7), volume fraction (3), strain (1), density (1).</w:t>
+            </w:r>
+          </w:p>
+        </w:tc>
+        <w:tc>
+          <w:tcPr>
+            <w:tcW w:type="dxa" w:w="1440"/>
+          </w:tcPr>
+          <w:p>
+            <w:r>
+              <w:t>see flags column</w:t>
+            </w:r>
+          </w:p>
+        </w:tc>
+      </w:tr>
+    </w:tbl>
+    <w:p/>
     <w:p>
       <w:pPr>
         <w:pStyle w:val="Heading1"/>

</xml_diff>